<commit_message>
Ajout des template via mpdf
</commit_message>
<xml_diff>
--- a/cabinet_dentaire_back/resources/template/template_facture.docx
+++ b/cabinet_dentaire_back/resources/template/template_facture.docx
@@ -4,82 +4,13 @@
   <w:body>
     <w:p>
       <w:pPr>
-        <w:spacing w:before="240" w:line="288" w:lineRule="auto"/>
-        <w:rPr>
-          <w:b/>
-          <w:sz w:val="56"/>
+        <w:spacing w:before="240" w:after="240"/>
+        <w:rPr>
+          <w:b/>
+          <w:bCs/>
         </w:rPr>
       </w:pPr>
       <w:bookmarkStart w:id="0" w:name="nom_du_cabinet"/>
-    </w:p>
-    <w:p>
-      <w:pPr>
-        <w:spacing w:before="240" w:line="288" w:lineRule="auto"/>
-        <w:rPr>
-          <w:b/>
-          <w:sz w:val="56"/>
-        </w:rPr>
-      </w:pPr>
-      <w:bookmarkStart w:id="1" w:name="_GoBack"/>
-      <w:r>
-        <w:rPr>
-          <w:b/>
-          <w:noProof/>
-          <w:sz w:val="56"/>
-          <w:lang w:eastAsia="fr-FR"/>
-        </w:rPr>
-        <w:drawing>
-          <wp:inline distT="0" distB="0" distL="0" distR="0">
-            <wp:extent cx="1383526" cy="1383526"/>
-            <wp:effectExtent l="0" t="0" r="7620" b="7620"/>
-            <wp:docPr id="1" name="Image 1"/>
-            <wp:cNvGraphicFramePr>
-              <a:graphicFrameLocks xmlns:a="http://schemas.openxmlformats.org/drawingml/2006/main" noChangeAspect="1"/>
-            </wp:cNvGraphicFramePr>
-            <a:graphic xmlns:a="http://schemas.openxmlformats.org/drawingml/2006/main">
-              <a:graphicData uri="http://schemas.openxmlformats.org/drawingml/2006/picture">
-                <pic:pic xmlns:pic="http://schemas.openxmlformats.org/drawingml/2006/picture">
-                  <pic:nvPicPr>
-                    <pic:cNvPr id="1" name="logoCabinet.png"/>
-                    <pic:cNvPicPr/>
-                  </pic:nvPicPr>
-                  <pic:blipFill>
-                    <a:blip r:embed="rId4" cstate="print">
-                      <a:extLst>
-                        <a:ext uri="{28A0092B-C50C-407E-A947-70E740481C1C}">
-                          <a14:useLocalDpi xmlns:a14="http://schemas.microsoft.com/office/drawing/2010/main" val="0"/>
-                        </a:ext>
-                      </a:extLst>
-                    </a:blip>
-                    <a:stretch>
-                      <a:fillRect/>
-                    </a:stretch>
-                  </pic:blipFill>
-                  <pic:spPr>
-                    <a:xfrm>
-                      <a:off x="0" y="0"/>
-                      <a:ext cx="1387401" cy="1387401"/>
-                    </a:xfrm>
-                    <a:prstGeom prst="rect">
-                      <a:avLst/>
-                    </a:prstGeom>
-                  </pic:spPr>
-                </pic:pic>
-              </a:graphicData>
-            </a:graphic>
-          </wp:inline>
-        </w:drawing>
-      </w:r>
-      <w:bookmarkEnd w:id="1"/>
-    </w:p>
-    <w:p>
-      <w:pPr>
-        <w:spacing w:before="240" w:after="240"/>
-        <w:rPr>
-          <w:b/>
-          <w:bCs/>
-        </w:rPr>
-      </w:pPr>
       <w:r>
         <w:rPr>
           <w:b/>
@@ -286,16 +217,18 @@
           <w:szCs w:val="32"/>
         </w:rPr>
       </w:pPr>
-      <w:bookmarkStart w:id="2" w:name="informations_patient"/>
+      <w:bookmarkStart w:id="1" w:name="informations_patient"/>
+      <w:bookmarkStart w:id="2" w:name="_GoBack"/>
+      <w:bookmarkEnd w:id="2"/>
       <w:r>
         <w:rPr>
           <w:b/>
           <w:sz w:val="32"/>
           <w:szCs w:val="32"/>
         </w:rPr>
-        <w:t>Informations Patient</w:t>
-      </w:r>
-      <w:bookmarkEnd w:id="2"/>
+        <w:t>Patient</w:t>
+      </w:r>
+      <w:bookmarkEnd w:id="1"/>
     </w:p>
     <w:p>
       <w:pPr>
@@ -392,21 +325,22 @@
     <w:tbl>
       <w:tblPr>
         <w:tblStyle w:val="NormalGrid"/>
-        <w:tblW w:w="0" w:type="auto"/>
+        <w:tblW w:w="8600" w:type="dxa"/>
         <w:jc w:val="center"/>
         <w:tblCellSpacing w:w="0" w:type="dxa"/>
         <w:tblLook w:val="04A0" w:firstRow="1" w:lastRow="0" w:firstColumn="1" w:lastColumn="0" w:noHBand="0" w:noVBand="1"/>
       </w:tblPr>
       <w:tblGrid>
-        <w:gridCol w:w="1709"/>
-        <w:gridCol w:w="1658"/>
+        <w:gridCol w:w="1686"/>
         <w:gridCol w:w="1635"/>
-        <w:gridCol w:w="1692"/>
-        <w:gridCol w:w="1976"/>
+        <w:gridCol w:w="1617"/>
+        <w:gridCol w:w="1673"/>
+        <w:gridCol w:w="1989"/>
       </w:tblGrid>
       <w:tr>
         <w:trPr>
           <w:cantSplit/>
+          <w:trHeight w:val="483"/>
           <w:tblCellSpacing w:w="0" w:type="dxa"/>
           <w:jc w:val="center"/>
         </w:trPr>
@@ -517,7 +451,13 @@
               <w:rPr>
                 <w:b/>
               </w:rPr>
-              <w:t>Montant (MAD)</w:t>
+              <w:t>Montant (FCFA</w:t>
+            </w:r>
+            <w:r>
+              <w:rPr>
+                <w:b/>
+              </w:rPr>
+              <w:t>)</w:t>
             </w:r>
           </w:p>
         </w:tc>
@@ -525,6 +465,7 @@
       <w:tr>
         <w:trPr>
           <w:cantSplit/>
+          <w:trHeight w:val="471"/>
           <w:tblCellSpacing w:w="0" w:type="dxa"/>
           <w:jc w:val="center"/>
         </w:trPr>
@@ -533,7 +474,6 @@
             <w:tcW w:w="0" w:type="auto"/>
             <w:tcBorders>
               <w:left w:val="single" w:sz="8" w:space="0" w:color="000000"/>
-              <w:bottom w:val="single" w:sz="8" w:space="0" w:color="000000"/>
               <w:right w:val="single" w:sz="8" w:space="0" w:color="000000"/>
             </w:tcBorders>
             <w:vAlign w:val="center"/>
@@ -548,7 +488,6 @@
           <w:tcPr>
             <w:tcW w:w="0" w:type="auto"/>
             <w:tcBorders>
-              <w:bottom w:val="single" w:sz="8" w:space="0" w:color="000000"/>
               <w:right w:val="single" w:sz="8" w:space="0" w:color="000000"/>
             </w:tcBorders>
             <w:vAlign w:val="center"/>
@@ -563,7 +502,6 @@
           <w:tcPr>
             <w:tcW w:w="0" w:type="auto"/>
             <w:tcBorders>
-              <w:bottom w:val="single" w:sz="8" w:space="0" w:color="000000"/>
               <w:right w:val="single" w:sz="8" w:space="0" w:color="000000"/>
             </w:tcBorders>
             <w:vAlign w:val="center"/>
@@ -578,7 +516,6 @@
           <w:tcPr>
             <w:tcW w:w="0" w:type="auto"/>
             <w:tcBorders>
-              <w:bottom w:val="single" w:sz="8" w:space="0" w:color="000000"/>
               <w:right w:val="single" w:sz="8" w:space="0" w:color="000000"/>
             </w:tcBorders>
             <w:vAlign w:val="center"/>
@@ -593,7 +530,6 @@
           <w:tcPr>
             <w:tcW w:w="0" w:type="auto"/>
             <w:tcBorders>
-              <w:bottom w:val="single" w:sz="8" w:space="0" w:color="000000"/>
               <w:right w:val="single" w:sz="8" w:space="0" w:color="000000"/>
             </w:tcBorders>
             <w:vAlign w:val="center"/>
@@ -608,25 +544,341 @@
           </w:p>
         </w:tc>
       </w:tr>
+      <w:tr>
+        <w:trPr>
+          <w:cantSplit/>
+          <w:trHeight w:val="19"/>
+          <w:tblCellSpacing w:w="0" w:type="dxa"/>
+          <w:jc w:val="center"/>
+        </w:trPr>
+        <w:tc>
+          <w:tcPr>
+            <w:tcW w:w="0" w:type="auto"/>
+            <w:tcBorders>
+              <w:left w:val="single" w:sz="8" w:space="0" w:color="000000"/>
+              <w:bottom w:val="single" w:sz="8" w:space="0" w:color="000000"/>
+              <w:right w:val="single" w:sz="8" w:space="0" w:color="000000"/>
+            </w:tcBorders>
+            <w:vAlign w:val="center"/>
+          </w:tcPr>
+          <w:p/>
+        </w:tc>
+        <w:tc>
+          <w:tcPr>
+            <w:tcW w:w="0" w:type="auto"/>
+            <w:tcBorders>
+              <w:bottom w:val="single" w:sz="8" w:space="0" w:color="000000"/>
+              <w:right w:val="single" w:sz="8" w:space="0" w:color="000000"/>
+            </w:tcBorders>
+            <w:vAlign w:val="center"/>
+          </w:tcPr>
+          <w:p/>
+        </w:tc>
+        <w:tc>
+          <w:tcPr>
+            <w:tcW w:w="0" w:type="auto"/>
+            <w:tcBorders>
+              <w:bottom w:val="single" w:sz="8" w:space="0" w:color="000000"/>
+              <w:right w:val="single" w:sz="8" w:space="0" w:color="000000"/>
+            </w:tcBorders>
+            <w:vAlign w:val="center"/>
+          </w:tcPr>
+          <w:p/>
+        </w:tc>
+        <w:tc>
+          <w:tcPr>
+            <w:tcW w:w="0" w:type="auto"/>
+            <w:tcBorders>
+              <w:bottom w:val="single" w:sz="8" w:space="0" w:color="000000"/>
+              <w:right w:val="single" w:sz="8" w:space="0" w:color="000000"/>
+            </w:tcBorders>
+            <w:vAlign w:val="center"/>
+          </w:tcPr>
+          <w:p/>
+        </w:tc>
+        <w:tc>
+          <w:tcPr>
+            <w:tcW w:w="0" w:type="auto"/>
+            <w:tcBorders>
+              <w:bottom w:val="single" w:sz="8" w:space="0" w:color="000000"/>
+              <w:right w:val="single" w:sz="8" w:space="0" w:color="000000"/>
+            </w:tcBorders>
+            <w:vAlign w:val="center"/>
+          </w:tcPr>
+          <w:p>
+            <w:pPr>
+              <w:jc w:val="right"/>
+            </w:pPr>
+          </w:p>
+        </w:tc>
+      </w:tr>
+      <w:tr>
+        <w:trPr>
+          <w:cantSplit/>
+          <w:trHeight w:val="471"/>
+          <w:tblCellSpacing w:w="0" w:type="dxa"/>
+          <w:jc w:val="center"/>
+        </w:trPr>
+        <w:tc>
+          <w:tcPr>
+            <w:tcW w:w="0" w:type="auto"/>
+            <w:tcBorders>
+              <w:left w:val="single" w:sz="8" w:space="0" w:color="000000"/>
+              <w:bottom w:val="single" w:sz="8" w:space="0" w:color="000000"/>
+              <w:right w:val="single" w:sz="8" w:space="0" w:color="000000"/>
+            </w:tcBorders>
+            <w:vAlign w:val="center"/>
+          </w:tcPr>
+          <w:p>
+            <w:r>
+              <w:t>Total</w:t>
+            </w:r>
+          </w:p>
+        </w:tc>
+        <w:tc>
+          <w:tcPr>
+            <w:tcW w:w="0" w:type="auto"/>
+            <w:tcBorders>
+              <w:bottom w:val="single" w:sz="8" w:space="0" w:color="000000"/>
+              <w:right w:val="single" w:sz="8" w:space="0" w:color="000000"/>
+            </w:tcBorders>
+            <w:vAlign w:val="center"/>
+          </w:tcPr>
+          <w:p/>
+        </w:tc>
+        <w:tc>
+          <w:tcPr>
+            <w:tcW w:w="0" w:type="auto"/>
+            <w:tcBorders>
+              <w:bottom w:val="single" w:sz="8" w:space="0" w:color="000000"/>
+              <w:right w:val="single" w:sz="8" w:space="0" w:color="000000"/>
+            </w:tcBorders>
+            <w:vAlign w:val="center"/>
+          </w:tcPr>
+          <w:p/>
+        </w:tc>
+        <w:tc>
+          <w:tcPr>
+            <w:tcW w:w="0" w:type="auto"/>
+            <w:tcBorders>
+              <w:bottom w:val="single" w:sz="8" w:space="0" w:color="000000"/>
+              <w:right w:val="single" w:sz="8" w:space="0" w:color="000000"/>
+            </w:tcBorders>
+            <w:vAlign w:val="center"/>
+          </w:tcPr>
+          <w:p/>
+        </w:tc>
+        <w:tc>
+          <w:tcPr>
+            <w:tcW w:w="0" w:type="auto"/>
+            <w:tcBorders>
+              <w:bottom w:val="single" w:sz="8" w:space="0" w:color="000000"/>
+              <w:right w:val="single" w:sz="8" w:space="0" w:color="000000"/>
+            </w:tcBorders>
+            <w:vAlign w:val="center"/>
+          </w:tcPr>
+          <w:p>
+            <w:pPr>
+              <w:jc w:val="center"/>
+            </w:pPr>
+            <w:r>
+              <w:t xml:space="preserve">    </w:t>
+            </w:r>
+            <w:r>
+              <w:t>${total}</w:t>
+            </w:r>
+          </w:p>
+        </w:tc>
+      </w:tr>
     </w:tbl>
     <w:p/>
-    <w:p/>
     <w:p>
-      <w:pPr>
-        <w:spacing w:before="240" w:after="240" w:line="271" w:lineRule="auto"/>
-        <w:rPr>
-          <w:sz w:val="36"/>
-          <w:szCs w:val="36"/>
-        </w:rPr>
-      </w:pPr>
+      <w:r>
+        <w:tab/>
+      </w:r>
+      <w:r>
+        <w:tab/>
+      </w:r>
+      <w:r>
+        <w:tab/>
+      </w:r>
+      <w:r>
+        <w:tab/>
+      </w:r>
+      <w:r>
+        <w:tab/>
+      </w:r>
+      <w:r>
+        <w:tab/>
+      </w:r>
+      <w:r>
+        <w:tab/>
+      </w:r>
+      <w:r>
+        <w:tab/>
+      </w:r>
+      <w:r>
+        <w:tab/>
+      </w:r>
+    </w:p>
+    <w:p>
+      <w:r>
+        <w:tab/>
+      </w:r>
+      <w:r>
+        <w:tab/>
+      </w:r>
+      <w:r>
+        <w:tab/>
+      </w:r>
+      <w:r>
+        <w:tab/>
+      </w:r>
+      <w:r>
+        <w:tab/>
+      </w:r>
+      <w:r>
+        <w:tab/>
+      </w:r>
+      <w:r>
+        <w:tab/>
+        <w:t xml:space="preserve">         </w:t>
+      </w:r>
+      <w:r>
+        <w:t xml:space="preserve">  </w:t>
+      </w:r>
+      <w:r>
+        <w:t>Signature et Cachet du m</w:t>
+      </w:r>
+      <w:r>
+        <w:t>é</w:t>
+      </w:r>
+      <w:r>
+        <w:t>decin</w:t>
+      </w:r>
     </w:p>
     <w:sectPr>
+      <w:headerReference w:type="default" r:id="rId6"/>
       <w:pgSz w:w="12240" w:h="15840"/>
       <w:pgMar w:top="1415" w:right="1775" w:bottom="1415" w:left="1775" w:header="720" w:footer="720" w:gutter="0"/>
       <w:cols w:space="720"/>
     </w:sectPr>
   </w:body>
 </w:document>
+</file>
+
+<file path=word/endnotes.xml><?xml version="1.0" encoding="utf-8"?>
+<w:endnotes xmlns:wpc="http://schemas.microsoft.com/office/word/2010/wordprocessingCanvas" xmlns:cx="http://schemas.microsoft.com/office/drawing/2014/chartex" xmlns:cx1="http://schemas.microsoft.com/office/drawing/2015/9/8/chartex" xmlns:mc="http://schemas.openxmlformats.org/markup-compatibility/2006" xmlns:o="urn:schemas-microsoft-com:office:office" xmlns:r="http://schemas.openxmlformats.org/officeDocument/2006/relationships" xmlns:m="http://schemas.openxmlformats.org/officeDocument/2006/math" xmlns:v="urn:schemas-microsoft-com:vml" xmlns:wp14="http://schemas.microsoft.com/office/word/2010/wordprocessingDrawing" xmlns:wp="http://schemas.openxmlformats.org/drawingml/2006/wordprocessingDrawing" xmlns:w10="urn:schemas-microsoft-com:office:word" xmlns:w="http://schemas.openxmlformats.org/wordprocessingml/2006/main" xmlns:w14="http://schemas.microsoft.com/office/word/2010/wordml" xmlns:w15="http://schemas.microsoft.com/office/word/2012/wordml" xmlns:w16se="http://schemas.microsoft.com/office/word/2015/wordml/symex" xmlns:wpg="http://schemas.microsoft.com/office/word/2010/wordprocessingGroup" xmlns:wpi="http://schemas.microsoft.com/office/word/2010/wordprocessingInk" xmlns:wne="http://schemas.microsoft.com/office/word/2006/wordml" xmlns:wps="http://schemas.microsoft.com/office/word/2010/wordprocessingShape" mc:Ignorable="w14 w15 w16se wp14">
+  <w:endnote w:type="separator" w:id="-1">
+    <w:p>
+      <w:pPr>
+        <w:spacing w:after="0" w:line="240" w:lineRule="auto"/>
+      </w:pPr>
+      <w:r>
+        <w:separator/>
+      </w:r>
+    </w:p>
+  </w:endnote>
+  <w:endnote w:type="continuationSeparator" w:id="0">
+    <w:p>
+      <w:pPr>
+        <w:spacing w:after="0" w:line="240" w:lineRule="auto"/>
+      </w:pPr>
+      <w:r>
+        <w:continuationSeparator/>
+      </w:r>
+    </w:p>
+  </w:endnote>
+</w:endnotes>
+</file>
+
+<file path=word/footnotes.xml><?xml version="1.0" encoding="utf-8"?>
+<w:footnotes xmlns:wpc="http://schemas.microsoft.com/office/word/2010/wordprocessingCanvas" xmlns:cx="http://schemas.microsoft.com/office/drawing/2014/chartex" xmlns:cx1="http://schemas.microsoft.com/office/drawing/2015/9/8/chartex" xmlns:mc="http://schemas.openxmlformats.org/markup-compatibility/2006" xmlns:o="urn:schemas-microsoft-com:office:office" xmlns:r="http://schemas.openxmlformats.org/officeDocument/2006/relationships" xmlns:m="http://schemas.openxmlformats.org/officeDocument/2006/math" xmlns:v="urn:schemas-microsoft-com:vml" xmlns:wp14="http://schemas.microsoft.com/office/word/2010/wordprocessingDrawing" xmlns:wp="http://schemas.openxmlformats.org/drawingml/2006/wordprocessingDrawing" xmlns:w10="urn:schemas-microsoft-com:office:word" xmlns:w="http://schemas.openxmlformats.org/wordprocessingml/2006/main" xmlns:w14="http://schemas.microsoft.com/office/word/2010/wordml" xmlns:w15="http://schemas.microsoft.com/office/word/2012/wordml" xmlns:w16se="http://schemas.microsoft.com/office/word/2015/wordml/symex" xmlns:wpg="http://schemas.microsoft.com/office/word/2010/wordprocessingGroup" xmlns:wpi="http://schemas.microsoft.com/office/word/2010/wordprocessingInk" xmlns:wne="http://schemas.microsoft.com/office/word/2006/wordml" xmlns:wps="http://schemas.microsoft.com/office/word/2010/wordprocessingShape" mc:Ignorable="w14 w15 w16se wp14">
+  <w:footnote w:type="separator" w:id="-1">
+    <w:p>
+      <w:pPr>
+        <w:spacing w:after="0" w:line="240" w:lineRule="auto"/>
+      </w:pPr>
+      <w:r>
+        <w:separator/>
+      </w:r>
+    </w:p>
+  </w:footnote>
+  <w:footnote w:type="continuationSeparator" w:id="0">
+    <w:p>
+      <w:pPr>
+        <w:spacing w:after="0" w:line="240" w:lineRule="auto"/>
+      </w:pPr>
+      <w:r>
+        <w:continuationSeparator/>
+      </w:r>
+    </w:p>
+  </w:footnote>
+</w:footnotes>
+</file>
+
+<file path=word/header1.xml><?xml version="1.0" encoding="utf-8"?>
+<w:hdr xmlns:wpc="http://schemas.microsoft.com/office/word/2010/wordprocessingCanvas" xmlns:cx="http://schemas.microsoft.com/office/drawing/2014/chartex" xmlns:cx1="http://schemas.microsoft.com/office/drawing/2015/9/8/chartex" xmlns:mc="http://schemas.openxmlformats.org/markup-compatibility/2006" xmlns:o="urn:schemas-microsoft-com:office:office" xmlns:r="http://schemas.openxmlformats.org/officeDocument/2006/relationships" xmlns:m="http://schemas.openxmlformats.org/officeDocument/2006/math" xmlns:v="urn:schemas-microsoft-com:vml" xmlns:wp14="http://schemas.microsoft.com/office/word/2010/wordprocessingDrawing" xmlns:wp="http://schemas.openxmlformats.org/drawingml/2006/wordprocessingDrawing" xmlns:w10="urn:schemas-microsoft-com:office:word" xmlns:w="http://schemas.openxmlformats.org/wordprocessingml/2006/main" xmlns:w14="http://schemas.microsoft.com/office/word/2010/wordml" xmlns:w15="http://schemas.microsoft.com/office/word/2012/wordml" xmlns:w16se="http://schemas.microsoft.com/office/word/2015/wordml/symex" xmlns:wpg="http://schemas.microsoft.com/office/word/2010/wordprocessingGroup" xmlns:wpi="http://schemas.microsoft.com/office/word/2010/wordprocessingInk" xmlns:wne="http://schemas.microsoft.com/office/word/2006/wordml" xmlns:wps="http://schemas.microsoft.com/office/word/2010/wordprocessingShape" mc:Ignorable="w14 w15 w16se wp14">
+  <w:p>
+    <w:pPr>
+      <w:pStyle w:val="En-tte"/>
+    </w:pPr>
+    <w:r>
+      <w:rPr>
+        <w:b/>
+        <w:noProof/>
+        <w:sz w:val="56"/>
+        <w:lang w:eastAsia="fr-FR"/>
+      </w:rPr>
+      <w:drawing>
+        <wp:inline distT="0" distB="0" distL="0" distR="0" wp14:anchorId="039CE306" wp14:editId="34BE11A1">
+          <wp:extent cx="1383526" cy="1383526"/>
+          <wp:effectExtent l="0" t="0" r="7620" b="7620"/>
+          <wp:docPr id="2" name="Image 2"/>
+          <wp:cNvGraphicFramePr>
+            <a:graphicFrameLocks xmlns:a="http://schemas.openxmlformats.org/drawingml/2006/main" noChangeAspect="1"/>
+          </wp:cNvGraphicFramePr>
+          <a:graphic xmlns:a="http://schemas.openxmlformats.org/drawingml/2006/main">
+            <a:graphicData uri="http://schemas.openxmlformats.org/drawingml/2006/picture">
+              <pic:pic xmlns:pic="http://schemas.openxmlformats.org/drawingml/2006/picture">
+                <pic:nvPicPr>
+                  <pic:cNvPr id="1" name="logoCabinet.png"/>
+                  <pic:cNvPicPr/>
+                </pic:nvPicPr>
+                <pic:blipFill>
+                  <a:blip r:embed="rId1" cstate="print">
+                    <a:extLst>
+                      <a:ext uri="{28A0092B-C50C-407E-A947-70E740481C1C}">
+                        <a14:useLocalDpi xmlns:a14="http://schemas.microsoft.com/office/drawing/2010/main" val="0"/>
+                      </a:ext>
+                    </a:extLst>
+                  </a:blip>
+                  <a:stretch>
+                    <a:fillRect/>
+                  </a:stretch>
+                </pic:blipFill>
+                <pic:spPr>
+                  <a:xfrm>
+                    <a:off x="0" y="0"/>
+                    <a:ext cx="1387401" cy="1387401"/>
+                  </a:xfrm>
+                  <a:prstGeom prst="rect">
+                    <a:avLst/>
+                  </a:prstGeom>
+                </pic:spPr>
+              </pic:pic>
+            </a:graphicData>
+          </a:graphic>
+        </wp:inline>
+      </w:drawing>
+    </w:r>
+  </w:p>
+  <w:p>
+    <w:pPr>
+      <w:pStyle w:val="En-tte"/>
+    </w:pPr>
+  </w:p>
+</w:hdr>
 </file>
 
 <file path=word/styles.xml><?xml version="1.0" encoding="utf-8"?>
@@ -1072,6 +1324,50 @@
       </w:tblCellMar>
     </w:tblPr>
   </w:style>
+  <w:style w:type="paragraph" w:styleId="En-tte">
+    <w:name w:val="header"/>
+    <w:basedOn w:val="Normal"/>
+    <w:link w:val="En-tteCar"/>
+    <w:uiPriority w:val="99"/>
+    <w:unhideWhenUsed/>
+    <w:rsid w:val="00B0722B"/>
+    <w:pPr>
+      <w:tabs>
+        <w:tab w:val="center" w:pos="4536"/>
+        <w:tab w:val="right" w:pos="9072"/>
+      </w:tabs>
+      <w:spacing w:after="0" w:line="240" w:lineRule="auto"/>
+    </w:pPr>
+  </w:style>
+  <w:style w:type="character" w:customStyle="1" w:styleId="En-tteCar">
+    <w:name w:val="En-tête Car"/>
+    <w:basedOn w:val="Policepardfaut"/>
+    <w:link w:val="En-tte"/>
+    <w:uiPriority w:val="99"/>
+    <w:rsid w:val="00B0722B"/>
+  </w:style>
+  <w:style w:type="paragraph" w:styleId="Pieddepage">
+    <w:name w:val="footer"/>
+    <w:basedOn w:val="Normal"/>
+    <w:link w:val="PieddepageCar"/>
+    <w:uiPriority w:val="99"/>
+    <w:unhideWhenUsed/>
+    <w:rsid w:val="00B0722B"/>
+    <w:pPr>
+      <w:tabs>
+        <w:tab w:val="center" w:pos="4536"/>
+        <w:tab w:val="right" w:pos="9072"/>
+      </w:tabs>
+      <w:spacing w:after="0" w:line="240" w:lineRule="auto"/>
+    </w:pPr>
+  </w:style>
+  <w:style w:type="character" w:customStyle="1" w:styleId="PieddepageCar">
+    <w:name w:val="Pied de page Car"/>
+    <w:basedOn w:val="Policepardfaut"/>
+    <w:link w:val="Pieddepage"/>
+    <w:uiPriority w:val="99"/>
+    <w:rsid w:val="00B0722B"/>
+  </w:style>
 </w:styles>
 </file>
 

</xml_diff>